<commit_message>
fix - fixed the 4th bug report
</commit_message>
<xml_diff>
--- a/BugReporting/ECEBUG4.docx
+++ b/BugReporting/ECEBUG4.docx
@@ -39,7 +39,7 @@
           <w:sz w:val="48"/>
           <w:szCs w:val="48"/>
         </w:rPr>
-        <w:t xml:space="preserve">Title: Windows 11 Pro – Navbar – </w:t>
+        <w:t xml:space="preserve">Title: Windows 11 Pro – </w:t>
       </w:r>
       <w:r>
         <w:rPr>
@@ -48,7 +48,7 @@
           <w:sz w:val="48"/>
           <w:szCs w:val="48"/>
         </w:rPr>
-        <w:t xml:space="preserve">Resource and News links don’t </w:t>
+        <w:t>Travel Policies</w:t>
       </w:r>
       <w:r>
         <w:rPr>
@@ -57,7 +57,16 @@
           <w:sz w:val="48"/>
           <w:szCs w:val="48"/>
         </w:rPr>
-        <w:t>navigate to anywhere</w:t>
+        <w:t xml:space="preserve"> – </w:t>
+      </w:r>
+      <w:r>
+        <w:rPr>
+          <w:b/>
+          <w:bCs/>
+          <w:sz w:val="48"/>
+          <w:szCs w:val="48"/>
+        </w:rPr>
+        <w:t>Link on the travel policies page give an error message</w:t>
       </w:r>
     </w:p>
     <w:p>
@@ -331,6 +340,7 @@
         </w:rPr>
         <w:t xml:space="preserve"> | </w:t>
       </w:r>
+      <w:proofErr w:type="gramStart"/>
       <w:r>
         <w:rPr>
           <w:b/>
@@ -353,6 +363,7 @@
         </w:rPr>
         <w:t xml:space="preserve"> ]</w:t>
       </w:r>
+      <w:proofErr w:type="gramEnd"/>
       <w:r>
         <w:rPr>
           <w:b/>
@@ -404,6 +415,7 @@
           <w:iCs/>
           <w:sz w:val="32"/>
           <w:szCs w:val="32"/>
+          <w:highlight w:val="yellow"/>
         </w:rPr>
         <w:t>Medium</w:t>
       </w:r>
@@ -418,6 +430,7 @@
         </w:rPr>
         <w:t xml:space="preserve"> | </w:t>
       </w:r>
+      <w:proofErr w:type="gramStart"/>
       <w:r>
         <w:rPr>
           <w:b/>
@@ -426,7 +439,6 @@
           <w:iCs/>
           <w:sz w:val="32"/>
           <w:szCs w:val="32"/>
-          <w:highlight w:val="yellow"/>
         </w:rPr>
         <w:t>Low</w:t>
       </w:r>
@@ -441,6 +453,7 @@
         </w:rPr>
         <w:t xml:space="preserve"> ]</w:t>
       </w:r>
+      <w:proofErr w:type="gramEnd"/>
       <w:r>
         <w:rPr>
           <w:b/>
@@ -527,8 +540,21 @@
           <w:sz w:val="32"/>
           <w:szCs w:val="32"/>
         </w:rPr>
-        <w:t xml:space="preserve"> | Content | Performance | Crash ]</w:t>
-      </w:r>
+        <w:t xml:space="preserve"> | Content | Performance | </w:t>
+      </w:r>
+      <w:proofErr w:type="gramStart"/>
+      <w:r>
+        <w:rPr>
+          <w:b/>
+          <w:bCs/>
+          <w:i/>
+          <w:iCs/>
+          <w:sz w:val="32"/>
+          <w:szCs w:val="32"/>
+        </w:rPr>
+        <w:t>Crash ]</w:t>
+      </w:r>
+      <w:proofErr w:type="gramEnd"/>
       <w:r>
         <w:rPr>
           <w:b/>
@@ -593,8 +619,21 @@
           <w:sz w:val="32"/>
           <w:szCs w:val="32"/>
         </w:rPr>
-        <w:t xml:space="preserve"> | Often | Sometimes | Rarely | Once ]</w:t>
-      </w:r>
+        <w:t xml:space="preserve"> | Often | Sometimes | Rarely | </w:t>
+      </w:r>
+      <w:proofErr w:type="gramStart"/>
+      <w:r>
+        <w:rPr>
+          <w:b/>
+          <w:bCs/>
+          <w:i/>
+          <w:iCs/>
+          <w:sz w:val="32"/>
+          <w:szCs w:val="32"/>
+        </w:rPr>
+        <w:t>Once ]</w:t>
+      </w:r>
+      <w:proofErr w:type="gramEnd"/>
       <w:r>
         <w:rPr>
           <w:b/>
@@ -685,7 +724,7 @@
           <w:sz w:val="32"/>
           <w:szCs w:val="32"/>
         </w:rPr>
-        <w:t>Click “Menu” in top right corner</w:t>
+        <w:t>Scroll down to footer</w:t>
       </w:r>
     </w:p>
     <w:p>
@@ -717,8 +756,82 @@
           <w:sz w:val="32"/>
           <w:szCs w:val="32"/>
         </w:rPr>
-        <w:t>“Resources” Link or the “News, Honors &amp; Awards” Link</w:t>
-      </w:r>
+        <w:t>“</w:t>
+      </w:r>
+      <w:r>
+        <w:rPr>
+          <w:b/>
+          <w:bCs/>
+          <w:sz w:val="32"/>
+          <w:szCs w:val="32"/>
+        </w:rPr>
+        <w:t>Travel Policies</w:t>
+      </w:r>
+      <w:r>
+        <w:rPr>
+          <w:b/>
+          <w:bCs/>
+          <w:sz w:val="32"/>
+          <w:szCs w:val="32"/>
+        </w:rPr>
+        <w:t xml:space="preserve">” Link </w:t>
+      </w:r>
+    </w:p>
+    <w:p>
+      <w:pPr>
+        <w:numPr>
+          <w:ilvl w:val="0"/>
+          <w:numId w:val="3"/>
+        </w:numPr>
+        <w:rPr>
+          <w:b/>
+          <w:bCs/>
+          <w:sz w:val="32"/>
+          <w:szCs w:val="32"/>
+        </w:rPr>
+      </w:pPr>
+      <w:r>
+        <w:rPr>
+          <w:b/>
+          <w:bCs/>
+          <w:sz w:val="32"/>
+          <w:szCs w:val="32"/>
+        </w:rPr>
+        <w:t>Scroll down to the “Updated UF Guidance on Travel” section</w:t>
+      </w:r>
+    </w:p>
+    <w:p>
+      <w:pPr>
+        <w:numPr>
+          <w:ilvl w:val="0"/>
+          <w:numId w:val="3"/>
+        </w:numPr>
+        <w:rPr>
+          <w:b/>
+          <w:bCs/>
+          <w:sz w:val="32"/>
+          <w:szCs w:val="32"/>
+        </w:rPr>
+      </w:pPr>
+      <w:r>
+        <w:rPr>
+          <w:b/>
+          <w:bCs/>
+          <w:sz w:val="32"/>
+          <w:szCs w:val="32"/>
+        </w:rPr>
+        <w:t>Click the “TripSource website”</w:t>
+      </w:r>
+    </w:p>
+    <w:p>
+      <w:pPr>
+        <w:rPr>
+          <w:b/>
+          <w:bCs/>
+          <w:sz w:val="32"/>
+          <w:szCs w:val="32"/>
+        </w:rPr>
+      </w:pPr>
     </w:p>
     <w:p>
       <w:pPr>
@@ -813,7 +926,16 @@
           <w:sz w:val="32"/>
           <w:szCs w:val="32"/>
         </w:rPr>
-        <w:t>to a page about Resources or not have a link for it.</w:t>
+        <w:t>to</w:t>
+      </w:r>
+      <w:r>
+        <w:rPr>
+          <w:b/>
+          <w:bCs/>
+          <w:sz w:val="32"/>
+          <w:szCs w:val="32"/>
+        </w:rPr>
+        <w:t xml:space="preserve"> the trip source website.</w:t>
       </w:r>
     </w:p>
     <w:p>
@@ -836,6 +958,7 @@
           <w:sz w:val="32"/>
           <w:szCs w:val="32"/>
         </w:rPr>
+        <w:lastRenderedPageBreak/>
         <w:t>Actual Result:</w:t>
       </w:r>
       <w:r>
@@ -854,25 +977,25 @@
           <w:sz w:val="32"/>
           <w:szCs w:val="32"/>
         </w:rPr>
-        <w:t xml:space="preserve">The link doesn’t send you anywhere and keeps </w:t>
-      </w:r>
-      <w:r>
-        <w:rPr>
-          <w:b/>
-          <w:bCs/>
-          <w:sz w:val="32"/>
-          <w:szCs w:val="32"/>
-        </w:rPr>
-        <w:t xml:space="preserve">the user </w:t>
-      </w:r>
-      <w:r>
-        <w:rPr>
-          <w:b/>
-          <w:bCs/>
-          <w:sz w:val="32"/>
-          <w:szCs w:val="32"/>
-        </w:rPr>
-        <w:t>on the current page.</w:t>
+        <w:t>The link gives an error message saying “</w:t>
+      </w:r>
+      <w:r>
+        <w:rPr>
+          <w:b/>
+          <w:bCs/>
+          <w:sz w:val="32"/>
+          <w:szCs w:val="32"/>
+        </w:rPr>
+        <w:t>No URL found for this tracker ID</w:t>
+      </w:r>
+      <w:r>
+        <w:rPr>
+          <w:b/>
+          <w:bCs/>
+          <w:sz w:val="32"/>
+          <w:szCs w:val="32"/>
+        </w:rPr>
+        <w:t>.”</w:t>
       </w:r>
     </w:p>
     <w:p>
@@ -891,7 +1014,6 @@
           <w:sz w:val="32"/>
           <w:szCs w:val="32"/>
         </w:rPr>
-        <w:lastRenderedPageBreak/>
         <w:t>6. Evidence &amp; Attachments</w:t>
       </w:r>
     </w:p>
@@ -917,6 +1039,17 @@
         </w:rPr>
         <w:t xml:space="preserve">Screenshots: </w:t>
       </w:r>
+    </w:p>
+    <w:p>
+      <w:pPr>
+        <w:ind w:left="720"/>
+        <w:rPr>
+          <w:b/>
+          <w:bCs/>
+          <w:sz w:val="32"/>
+          <w:szCs w:val="32"/>
+        </w:rPr>
+      </w:pPr>
       <w:r>
         <w:rPr>
           <w:b/>
@@ -926,10 +1059,10 @@
           <w:szCs w:val="32"/>
         </w:rPr>
         <w:drawing>
-          <wp:inline distT="0" distB="0" distL="0" distR="0" wp14:anchorId="554D61E0" wp14:editId="14B0B03C">
-            <wp:extent cx="5657570" cy="3333750"/>
-            <wp:effectExtent l="0" t="0" r="635" b="0"/>
-            <wp:docPr id="1919759046" name="Picture 1" descr="The image shows a webpage displaying the UF Department of Electrical and Computer Engineering, featuring sections on pain relief research, academic achievements, and links to resources and news.&#10;&#10;AI-generated content may be incorrect."/>
+          <wp:inline distT="0" distB="0" distL="0" distR="0" wp14:anchorId="74DB014D" wp14:editId="1B2FBC18">
+            <wp:extent cx="6858000" cy="4039235"/>
+            <wp:effectExtent l="0" t="0" r="0" b="0"/>
+            <wp:docPr id="1601610138" name="Picture 1" descr="The image shows a web page with a URL and a tracking ID, but no content or image.&#10;&#10;AI-generated content may be incorrect."/>
             <wp:cNvGraphicFramePr>
               <a:graphicFrameLocks xmlns:a="http://schemas.openxmlformats.org/drawingml/2006/main" noChangeAspect="1"/>
             </wp:cNvGraphicFramePr>
@@ -937,10 +1070,10 @@
               <a:graphicData uri="http://schemas.openxmlformats.org/drawingml/2006/picture">
                 <pic:pic xmlns:pic="http://schemas.openxmlformats.org/drawingml/2006/picture">
                   <pic:nvPicPr>
-                    <pic:cNvPr id="1919759046" name="Picture 1" descr="The image shows a webpage displaying the UF Department of Electrical and Computer Engineering, featuring sections on pain relief research, academic achievements, and links to resources and news.&#10;&#10;AI-generated content may be incorrect."/>
+                    <pic:cNvPr id="1601610138" name="Picture 1" descr="The image shows a web page with a URL and a tracking ID, but no content or image.&#10;&#10;AI-generated content may be incorrect."/>
                     <pic:cNvPicPr/>
                   </pic:nvPicPr>
-                  <pic:blipFill rotWithShape="1">
+                  <pic:blipFill>
                     <a:blip r:embed="rId5">
                       <a:extLst>
                         <a:ext uri="{28A0092B-C50C-407E-A947-70E740481C1C}">
@@ -948,27 +1081,18 @@
                         </a:ext>
                       </a:extLst>
                     </a:blip>
-                    <a:srcRect b="5678"/>
                     <a:stretch>
                       <a:fillRect/>
                     </a:stretch>
                   </pic:blipFill>
-                  <pic:spPr bwMode="auto">
+                  <pic:spPr>
                     <a:xfrm>
                       <a:off x="0" y="0"/>
-                      <a:ext cx="5657850" cy="3333915"/>
+                      <a:ext cx="6858000" cy="4039235"/>
                     </a:xfrm>
                     <a:prstGeom prst="rect">
                       <a:avLst/>
                     </a:prstGeom>
-                    <a:ln>
-                      <a:noFill/>
-                    </a:ln>
-                    <a:extLst>
-                      <a:ext uri="{53640926-AAD7-44D8-BBD7-CCE9431645EC}">
-                        <a14:shadowObscured xmlns:a14="http://schemas.microsoft.com/office/drawing/2010/main"/>
-                      </a:ext>
-                    </a:extLst>
                   </pic:spPr>
                 </pic:pic>
               </a:graphicData>
@@ -1017,7 +1141,7 @@
           <w:sz w:val="32"/>
           <w:szCs w:val="32"/>
         </w:rPr>
-        <w:object w:dxaOrig="1539" w:dyaOrig="991" w14:anchorId="0E77DC88">
+        <w:object w:dxaOrig="1539" w:dyaOrig="991" w14:anchorId="2D8ED62C">
           <v:shapetype id="_x0000_t75" coordsize="21600,21600" o:spt="75" o:preferrelative="t" path="m@4@5l@4@11@9@11@9@5xe" filled="f" stroked="f">
             <v:stroke joinstyle="miter"/>
             <v:formulas>
@@ -1037,10 +1161,10 @@
             <v:path o:extrusionok="f" gradientshapeok="t" o:connecttype="rect"/>
             <o:lock v:ext="edit" aspectratio="t"/>
           </v:shapetype>
-          <v:shape id="_x0000_i1025" type="#_x0000_t75" style="width:77.25pt;height:49.5pt" o:ole="">
+          <v:shape id="_x0000_i1031" type="#_x0000_t75" style="width:77.25pt;height:49.5pt" o:ole="">
             <v:imagedata r:id="rId6" o:title=""/>
           </v:shape>
-          <o:OLEObject Type="Embed" ProgID="Package" ShapeID="_x0000_i1025" DrawAspect="Icon" ObjectID="_1852034389" r:id="rId7"/>
+          <o:OLEObject Type="Embed" ProgID="Package" ShapeID="_x0000_i1031" DrawAspect="Icon" ObjectID="_1852035556" r:id="rId7"/>
         </w:object>
       </w:r>
     </w:p>
@@ -2861,7 +2985,6 @@
   <w:style w:type="character" w:default="1" w:styleId="DefaultParagraphFont">
     <w:name w:val="Default Paragraph Font"/>
     <w:uiPriority w:val="1"/>
-    <w:semiHidden/>
     <w:unhideWhenUsed/>
   </w:style>
   <w:style w:type="table" w:default="1" w:styleId="TableNormal">

</xml_diff>